<commit_message>
Updated PHP notes and codes
</commit_message>
<xml_diff>
--- a/PHP notes.docx
+++ b/PHP notes.docx
@@ -33,17 +33,8 @@
           <w:sz w:val="28"/>
           <w:szCs w:val="28"/>
         </w:rPr>
-        <w:t xml:space="preserve">You can be able to access them through either the key name global </w:t>
-      </w:r>
-      <w:proofErr w:type="spellStart"/>
-      <w:r>
-        <w:rPr>
-          <w:sz w:val="28"/>
-          <w:szCs w:val="28"/>
-        </w:rPr>
-        <w:t>e.g</w:t>
-      </w:r>
-      <w:proofErr w:type="spellEnd"/>
+        <w:t>You can be able to access them through either the key name global e.g</w:t>
+      </w:r>
     </w:p>
     <w:p>
       <w:pPr>
@@ -87,17 +78,8 @@
           <w:sz w:val="28"/>
           <w:szCs w:val="28"/>
         </w:rPr>
-        <w:t xml:space="preserve">Function </w:t>
-      </w:r>
-      <w:proofErr w:type="gramStart"/>
-      <w:r>
-        <w:rPr>
-          <w:sz w:val="28"/>
-          <w:szCs w:val="28"/>
-        </w:rPr>
-        <w:t>sum(){</w:t>
-      </w:r>
-      <w:proofErr w:type="gramEnd"/>
+        <w:t>Function sum(){</w:t>
+      </w:r>
     </w:p>
     <w:p>
       <w:pPr>
@@ -151,21 +133,12 @@
           <w:szCs w:val="28"/>
         </w:rPr>
       </w:pPr>
-      <w:proofErr w:type="gramStart"/>
-      <w:r>
-        <w:rPr>
-          <w:sz w:val="28"/>
-          <w:szCs w:val="28"/>
-        </w:rPr>
-        <w:t>Sum(</w:t>
-      </w:r>
-      <w:proofErr w:type="gramEnd"/>
-      <w:r>
-        <w:rPr>
-          <w:sz w:val="28"/>
-          <w:szCs w:val="28"/>
-        </w:rPr>
-        <w:t>);</w:t>
+      <w:r>
+        <w:rPr>
+          <w:sz w:val="28"/>
+          <w:szCs w:val="28"/>
+        </w:rPr>
+        <w:t>Sum();</w:t>
       </w:r>
     </w:p>
     <w:p>
@@ -195,39 +168,7 @@
           <w:sz w:val="28"/>
           <w:szCs w:val="28"/>
         </w:rPr>
-        <w:t xml:space="preserve">The above example </w:t>
-      </w:r>
-      <w:proofErr w:type="gramStart"/>
-      <w:r>
-        <w:rPr>
-          <w:sz w:val="28"/>
-          <w:szCs w:val="28"/>
-        </w:rPr>
-        <w:t>showcase</w:t>
-      </w:r>
-      <w:proofErr w:type="gramEnd"/>
-      <w:r>
-        <w:rPr>
-          <w:sz w:val="28"/>
-          <w:szCs w:val="28"/>
-        </w:rPr>
-        <w:t xml:space="preserve"> how you can access it. </w:t>
-      </w:r>
-      <w:proofErr w:type="gramStart"/>
-      <w:r>
-        <w:rPr>
-          <w:sz w:val="28"/>
-          <w:szCs w:val="28"/>
-        </w:rPr>
-        <w:t>The  other</w:t>
-      </w:r>
-      <w:proofErr w:type="gramEnd"/>
-      <w:r>
-        <w:rPr>
-          <w:sz w:val="28"/>
-          <w:szCs w:val="28"/>
-        </w:rPr>
-        <w:t xml:space="preserve"> method is through an associative array keyword with the name of the global variable being the key and the that variable being the value</w:t>
+        <w:t>The above example showcase how you can access it. The  other method is through an associative array keyword with the name of the global variable being the key and the that variable being the value</w:t>
       </w:r>
     </w:p>
     <w:p>
@@ -252,37 +193,12 @@
           <w:szCs w:val="28"/>
         </w:rPr>
       </w:pPr>
-      <w:proofErr w:type="spellStart"/>
-      <w:r>
-        <w:rPr>
-          <w:sz w:val="28"/>
-          <w:szCs w:val="28"/>
-        </w:rPr>
-        <w:t>Var_dump</w:t>
-      </w:r>
-      <w:proofErr w:type="spellEnd"/>
-      <w:r>
-        <w:rPr>
-          <w:sz w:val="28"/>
-          <w:szCs w:val="28"/>
-        </w:rPr>
-        <w:t xml:space="preserve"> – allows you to fully understand what your code is supposed to output. It is very handy for debugging. Same to </w:t>
-      </w:r>
-      <w:proofErr w:type="spellStart"/>
-      <w:r>
-        <w:rPr>
-          <w:sz w:val="28"/>
-          <w:szCs w:val="28"/>
-        </w:rPr>
-        <w:t>print_f</w:t>
-      </w:r>
-      <w:proofErr w:type="spellEnd"/>
-      <w:r>
-        <w:rPr>
-          <w:sz w:val="28"/>
-          <w:szCs w:val="28"/>
-        </w:rPr>
-        <w:t>;</w:t>
+      <w:r>
+        <w:rPr>
+          <w:sz w:val="28"/>
+          <w:szCs w:val="28"/>
+        </w:rPr>
+        <w:t>Var_dump – allows you to fully understand what your code is supposed to output. It is very handy for debugging. Same to print_f;</w:t>
       </w:r>
     </w:p>
     <w:p>
@@ -298,6 +214,65 @@
           <w:szCs w:val="28"/>
         </w:rPr>
         <w:t xml:space="preserve"> </w:t>
+      </w:r>
+      <w:r>
+        <w:rPr>
+          <w:sz w:val="28"/>
+          <w:szCs w:val="28"/>
+        </w:rPr>
+        <w:t>Match( it is a type of multiple conditional function ) is a better version of switch</w:t>
+      </w:r>
+    </w:p>
+    <w:p>
+      <w:pPr>
+        <w:rPr>
+          <w:sz w:val="28"/>
+          <w:szCs w:val="28"/>
+        </w:rPr>
+      </w:pPr>
+      <w:r>
+        <w:rPr>
+          <w:sz w:val="28"/>
+          <w:szCs w:val="28"/>
+        </w:rPr>
+        <w:t>Foreach- an easy way to iterate over arrays and traversable objects.</w:t>
+      </w:r>
+    </w:p>
+    <w:p>
+      <w:pPr>
+        <w:rPr>
+          <w:sz w:val="28"/>
+          <w:szCs w:val="28"/>
+        </w:rPr>
+      </w:pPr>
+      <w:r>
+        <w:rPr>
+          <w:sz w:val="28"/>
+          <w:szCs w:val="28"/>
+        </w:rPr>
+        <w:t>Named argument-Usually used when you want to assign a value without having to rely on it’s position only. For example: sum(a= 1, d= 3) see that I’ve assigned d where b should, yet, it will still register d as 3.</w:t>
+      </w:r>
+    </w:p>
+    <w:p>
+      <w:pPr>
+        <w:rPr>
+          <w:sz w:val="28"/>
+          <w:szCs w:val="28"/>
+        </w:rPr>
+      </w:pPr>
+      <w:r>
+        <w:rPr>
+          <w:sz w:val="28"/>
+          <w:szCs w:val="28"/>
+        </w:rPr>
+        <w:t>Callables-</w:t>
+      </w:r>
+      <w:r>
+        <w:rPr>
+          <w:sz w:val="28"/>
+          <w:szCs w:val="28"/>
+        </w:rPr>
+        <w:t xml:space="preserve"> are invoked when passing an argument to another function</w:t>
       </w:r>
     </w:p>
     <w:sectPr>

</xml_diff>

<commit_message>
Update on Json processing and CSV processing
</commit_message>
<xml_diff>
--- a/PHP notes.docx
+++ b/PHP notes.docx
@@ -265,7 +265,14 @@
           <w:sz w:val="28"/>
           <w:szCs w:val="28"/>
         </w:rPr>
-        <w:t>Callables-</w:t>
+        <w:t>Callable functions</w:t>
+      </w:r>
+      <w:r>
+        <w:rPr>
+          <w:sz w:val="28"/>
+          <w:szCs w:val="28"/>
+        </w:rPr>
+        <w:t>-</w:t>
       </w:r>
       <w:r>
         <w:rPr>
@@ -274,6 +281,100 @@
         </w:rPr>
         <w:t xml:space="preserve"> are invoked when passing an argument to another function</w:t>
       </w:r>
+    </w:p>
+    <w:p>
+      <w:pPr>
+        <w:rPr>
+          <w:sz w:val="28"/>
+          <w:szCs w:val="28"/>
+        </w:rPr>
+      </w:pPr>
+      <w:r>
+        <w:rPr>
+          <w:sz w:val="28"/>
+          <w:szCs w:val="28"/>
+        </w:rPr>
+        <w:t>Variadic variables – refers to variables that are able to pass any number of arguments</w:t>
+      </w:r>
+    </w:p>
+    <w:p>
+      <w:pPr>
+        <w:rPr>
+          <w:sz w:val="28"/>
+          <w:szCs w:val="28"/>
+        </w:rPr>
+      </w:pPr>
+      <w:r>
+        <w:rPr>
+          <w:sz w:val="28"/>
+          <w:szCs w:val="28"/>
+        </w:rPr>
+        <w:lastRenderedPageBreak/>
+        <w:t xml:space="preserve">CSV processing- </w:t>
+      </w:r>
+      <w:r>
+        <w:rPr>
+          <w:sz w:val="28"/>
+          <w:szCs w:val="28"/>
+        </w:rPr>
+        <w:t>CSV processing refers to handling CSV (Comma Separated Values) files in PHP, an operation significantly useful for managing tabular data. PHP provides a few key functions to handle CSV files effectively. For example, </w:t>
+      </w:r>
+      <w:r>
+        <w:rPr>
+          <w:b/>
+          <w:bCs/>
+          <w:sz w:val="28"/>
+          <w:szCs w:val="28"/>
+        </w:rPr>
+        <w:t>fgetcsv()</w:t>
+      </w:r>
+      <w:r>
+        <w:rPr>
+          <w:sz w:val="28"/>
+          <w:szCs w:val="28"/>
+        </w:rPr>
+        <w:t> allows you to read CSV file line by line, </w:t>
+      </w:r>
+      <w:r>
+        <w:rPr>
+          <w:b/>
+          <w:bCs/>
+          <w:sz w:val="28"/>
+          <w:szCs w:val="28"/>
+        </w:rPr>
+        <w:t>fputcsv()</w:t>
+      </w:r>
+      <w:r>
+        <w:rPr>
+          <w:sz w:val="28"/>
+          <w:szCs w:val="28"/>
+        </w:rPr>
+        <w:t> lets you write line by line into a CSV file, and </w:t>
+      </w:r>
+      <w:r>
+        <w:rPr>
+          <w:b/>
+          <w:bCs/>
+          <w:sz w:val="28"/>
+          <w:szCs w:val="28"/>
+        </w:rPr>
+        <w:t>str_getcsv()</w:t>
+      </w:r>
+      <w:r>
+        <w:rPr>
+          <w:sz w:val="28"/>
+          <w:szCs w:val="28"/>
+        </w:rPr>
+        <w:t> allows you to parse a CSV string into an array. A quick example of reading a CSV file:</w:t>
+      </w:r>
+    </w:p>
+    <w:p>
+      <w:pPr>
+        <w:rPr>
+          <w:sz w:val="28"/>
+          <w:szCs w:val="28"/>
+        </w:rPr>
+      </w:pPr>
     </w:p>
     <w:sectPr>
       <w:pgSz w:w="12240" w:h="15840"/>
@@ -888,7 +989,6 @@
   <w:style w:type="character" w:default="1" w:styleId="DefaultParagraphFont">
     <w:name w:val="Default Paragraph Font"/>
     <w:uiPriority w:val="1"/>
-    <w:semiHidden/>
     <w:unhideWhenUsed/>
   </w:style>
   <w:style w:type="table" w:default="1" w:styleId="TableNormal">

</xml_diff>

<commit_message>
Update on classes and text
</commit_message>
<xml_diff>
--- a/PHP notes.docx
+++ b/PHP notes.docx
@@ -366,6 +366,40 @@
           <w:szCs w:val="28"/>
         </w:rPr>
         <w:t> allows you to parse a CSV string into an array. A quick example of reading a CSV file:</w:t>
+      </w:r>
+    </w:p>
+    <w:p>
+      <w:pPr>
+        <w:rPr>
+          <w:b/>
+          <w:bCs/>
+          <w:sz w:val="40"/>
+          <w:szCs w:val="40"/>
+        </w:rPr>
+      </w:pPr>
+      <w:r>
+        <w:rPr>
+          <w:b/>
+          <w:bCs/>
+          <w:sz w:val="40"/>
+          <w:szCs w:val="40"/>
+        </w:rPr>
+        <w:t>Classes</w:t>
+      </w:r>
+    </w:p>
+    <w:p>
+      <w:pPr>
+        <w:rPr>
+          <w:sz w:val="28"/>
+          <w:szCs w:val="28"/>
+        </w:rPr>
+      </w:pPr>
+      <w:r>
+        <w:rPr>
+          <w:sz w:val="28"/>
+          <w:szCs w:val="28"/>
+        </w:rPr>
+        <w:t>In classes, the pseudo-variable $this is available when the method is called from within an objects context</w:t>
       </w:r>
     </w:p>
     <w:p>

</xml_diff>

<commit_message>
Static methods and properties
</commit_message>
<xml_diff>
--- a/PHP notes.docx
+++ b/PHP notes.docx
@@ -400,6 +400,42 @@
           <w:szCs w:val="28"/>
         </w:rPr>
         <w:t>In classes, the pseudo-variable $this is available when the method is called from within an objects context</w:t>
+      </w:r>
+    </w:p>
+    <w:p>
+      <w:pPr>
+        <w:rPr>
+          <w:sz w:val="28"/>
+          <w:szCs w:val="28"/>
+        </w:rPr>
+      </w:pPr>
+      <w:r>
+        <w:rPr>
+          <w:sz w:val="28"/>
+          <w:szCs w:val="28"/>
+        </w:rPr>
+        <w:t>STATIC methods and properties belong to the class rather than the instance of the class where they can be accessed without creating an object of the class</w:t>
+      </w:r>
+      <w:r>
+        <w:rPr>
+          <w:sz w:val="28"/>
+          <w:szCs w:val="28"/>
+        </w:rPr>
+        <w:t>. Uses the static keyword. The properties is the same, but they can</w:t>
+      </w:r>
+      <w:r>
+        <w:rPr>
+          <w:sz w:val="28"/>
+          <w:szCs w:val="28"/>
+        </w:rPr>
+        <w:t>not be accessed directly</w:t>
+      </w:r>
+      <w:r>
+        <w:rPr>
+          <w:sz w:val="28"/>
+          <w:szCs w:val="28"/>
+        </w:rPr>
+        <w:t>.</w:t>
       </w:r>
     </w:p>
     <w:p>
@@ -1023,6 +1059,7 @@
   <w:style w:type="character" w:default="1" w:styleId="DefaultParagraphFont">
     <w:name w:val="Default Paragraph Font"/>
     <w:uiPriority w:val="1"/>
+    <w:semiHidden/>
     <w:unhideWhenUsed/>
   </w:style>
   <w:style w:type="table" w:default="1" w:styleId="TableNormal">

</xml_diff>

<commit_message>
Slight update in php notes
</commit_message>
<xml_diff>
--- a/PHP notes.docx
+++ b/PHP notes.docx
@@ -33,8 +33,17 @@
           <w:sz w:val="28"/>
           <w:szCs w:val="28"/>
         </w:rPr>
-        <w:t>You can be able to access them through either the key name global e.g</w:t>
-      </w:r>
+        <w:t xml:space="preserve">You can be able to access them through either the key name global </w:t>
+      </w:r>
+      <w:proofErr w:type="spellStart"/>
+      <w:r>
+        <w:rPr>
+          <w:sz w:val="28"/>
+          <w:szCs w:val="28"/>
+        </w:rPr>
+        <w:t>e.g</w:t>
+      </w:r>
+      <w:proofErr w:type="spellEnd"/>
     </w:p>
     <w:p>
       <w:pPr>
@@ -78,8 +87,17 @@
           <w:sz w:val="28"/>
           <w:szCs w:val="28"/>
         </w:rPr>
-        <w:t>Function sum(){</w:t>
-      </w:r>
+        <w:t xml:space="preserve">Function </w:t>
+      </w:r>
+      <w:proofErr w:type="gramStart"/>
+      <w:r>
+        <w:rPr>
+          <w:sz w:val="28"/>
+          <w:szCs w:val="28"/>
+        </w:rPr>
+        <w:t>sum(){</w:t>
+      </w:r>
+      <w:proofErr w:type="gramEnd"/>
     </w:p>
     <w:p>
       <w:pPr>
@@ -133,12 +151,21 @@
           <w:szCs w:val="28"/>
         </w:rPr>
       </w:pPr>
-      <w:r>
-        <w:rPr>
-          <w:sz w:val="28"/>
-          <w:szCs w:val="28"/>
-        </w:rPr>
-        <w:t>Sum();</w:t>
+      <w:proofErr w:type="gramStart"/>
+      <w:r>
+        <w:rPr>
+          <w:sz w:val="28"/>
+          <w:szCs w:val="28"/>
+        </w:rPr>
+        <w:t>Sum(</w:t>
+      </w:r>
+      <w:proofErr w:type="gramEnd"/>
+      <w:r>
+        <w:rPr>
+          <w:sz w:val="28"/>
+          <w:szCs w:val="28"/>
+        </w:rPr>
+        <w:t>);</w:t>
       </w:r>
     </w:p>
     <w:p>
@@ -168,7 +195,39 @@
           <w:sz w:val="28"/>
           <w:szCs w:val="28"/>
         </w:rPr>
-        <w:t>The above example showcase how you can access it. The  other method is through an associative array keyword with the name of the global variable being the key and the that variable being the value</w:t>
+        <w:t xml:space="preserve">The above example </w:t>
+      </w:r>
+      <w:proofErr w:type="gramStart"/>
+      <w:r>
+        <w:rPr>
+          <w:sz w:val="28"/>
+          <w:szCs w:val="28"/>
+        </w:rPr>
+        <w:t>showcase</w:t>
+      </w:r>
+      <w:proofErr w:type="gramEnd"/>
+      <w:r>
+        <w:rPr>
+          <w:sz w:val="28"/>
+          <w:szCs w:val="28"/>
+        </w:rPr>
+        <w:t xml:space="preserve"> how you can access it. </w:t>
+      </w:r>
+      <w:proofErr w:type="gramStart"/>
+      <w:r>
+        <w:rPr>
+          <w:sz w:val="28"/>
+          <w:szCs w:val="28"/>
+        </w:rPr>
+        <w:t>The  other</w:t>
+      </w:r>
+      <w:proofErr w:type="gramEnd"/>
+      <w:r>
+        <w:rPr>
+          <w:sz w:val="28"/>
+          <w:szCs w:val="28"/>
+        </w:rPr>
+        <w:t xml:space="preserve"> method is through an associative array keyword with the name of the global variable being the key and the that variable being the value</w:t>
       </w:r>
     </w:p>
     <w:p>
@@ -193,12 +252,37 @@
           <w:szCs w:val="28"/>
         </w:rPr>
       </w:pPr>
-      <w:r>
-        <w:rPr>
-          <w:sz w:val="28"/>
-          <w:szCs w:val="28"/>
-        </w:rPr>
-        <w:t>Var_dump – allows you to fully understand what your code is supposed to output. It is very handy for debugging. Same to print_f;</w:t>
+      <w:proofErr w:type="spellStart"/>
+      <w:r>
+        <w:rPr>
+          <w:sz w:val="28"/>
+          <w:szCs w:val="28"/>
+        </w:rPr>
+        <w:t>Var_dump</w:t>
+      </w:r>
+      <w:proofErr w:type="spellEnd"/>
+      <w:r>
+        <w:rPr>
+          <w:sz w:val="28"/>
+          <w:szCs w:val="28"/>
+        </w:rPr>
+        <w:t xml:space="preserve"> – allows you to fully understand what your code is supposed to output. It is very handy for debugging. Same to </w:t>
+      </w:r>
+      <w:proofErr w:type="spellStart"/>
+      <w:r>
+        <w:rPr>
+          <w:sz w:val="28"/>
+          <w:szCs w:val="28"/>
+        </w:rPr>
+        <w:t>print_f</w:t>
+      </w:r>
+      <w:proofErr w:type="spellEnd"/>
+      <w:r>
+        <w:rPr>
+          <w:sz w:val="28"/>
+          <w:szCs w:val="28"/>
+        </w:rPr>
+        <w:t>;</w:t>
       </w:r>
     </w:p>
     <w:p>
@@ -215,12 +299,37 @@
         </w:rPr>
         <w:t xml:space="preserve"> </w:t>
       </w:r>
-      <w:r>
-        <w:rPr>
-          <w:sz w:val="28"/>
-          <w:szCs w:val="28"/>
-        </w:rPr>
-        <w:t>Match( it is a type of multiple conditional function ) is a better version of switch</w:t>
+      <w:proofErr w:type="gramStart"/>
+      <w:r>
+        <w:rPr>
+          <w:sz w:val="28"/>
+          <w:szCs w:val="28"/>
+        </w:rPr>
+        <w:t>Match( it</w:t>
+      </w:r>
+      <w:proofErr w:type="gramEnd"/>
+      <w:r>
+        <w:rPr>
+          <w:sz w:val="28"/>
+          <w:szCs w:val="28"/>
+        </w:rPr>
+        <w:t xml:space="preserve"> is a type of multiple conditional </w:t>
+      </w:r>
+      <w:proofErr w:type="gramStart"/>
+      <w:r>
+        <w:rPr>
+          <w:sz w:val="28"/>
+          <w:szCs w:val="28"/>
+        </w:rPr>
+        <w:t>function )</w:t>
+      </w:r>
+      <w:proofErr w:type="gramEnd"/>
+      <w:r>
+        <w:rPr>
+          <w:sz w:val="28"/>
+          <w:szCs w:val="28"/>
+        </w:rPr>
+        <w:t xml:space="preserve"> is a better version of switch</w:t>
       </w:r>
     </w:p>
     <w:p>
@@ -250,7 +359,41 @@
           <w:sz w:val="28"/>
           <w:szCs w:val="28"/>
         </w:rPr>
-        <w:t>Named argument-Usually used when you want to assign a value without having to rely on it’s position only. For example: sum(a= 1, d= 3) see that I’ve assigned d where b should, yet, it will still register d as 3.</w:t>
+        <w:t xml:space="preserve">Named argument-Usually used when you want to assign a value without having to rely on </w:t>
+      </w:r>
+      <w:proofErr w:type="spellStart"/>
+      <w:proofErr w:type="gramStart"/>
+      <w:r>
+        <w:rPr>
+          <w:sz w:val="28"/>
+          <w:szCs w:val="28"/>
+        </w:rPr>
+        <w:t>it’s</w:t>
+      </w:r>
+      <w:proofErr w:type="spellEnd"/>
+      <w:proofErr w:type="gramEnd"/>
+      <w:r>
+        <w:rPr>
+          <w:sz w:val="28"/>
+          <w:szCs w:val="28"/>
+        </w:rPr>
+        <w:t xml:space="preserve"> position only. For example: </w:t>
+      </w:r>
+      <w:proofErr w:type="gramStart"/>
+      <w:r>
+        <w:rPr>
+          <w:sz w:val="28"/>
+          <w:szCs w:val="28"/>
+        </w:rPr>
+        <w:t>sum(</w:t>
+      </w:r>
+      <w:proofErr w:type="gramEnd"/>
+      <w:r>
+        <w:rPr>
+          <w:sz w:val="28"/>
+          <w:szCs w:val="28"/>
+        </w:rPr>
+        <w:t>a= 1, d= 3) see that I’ve assigned d where b should, yet, it will still register d as 3.</w:t>
       </w:r>
     </w:p>
     <w:p>
@@ -319,6 +462,8 @@
         </w:rPr>
         <w:t>CSV processing refers to handling CSV (Comma Separated Values) files in PHP, an operation significantly useful for managing tabular data. PHP provides a few key functions to handle CSV files effectively. For example, </w:t>
       </w:r>
+      <w:proofErr w:type="spellStart"/>
+      <w:proofErr w:type="gramStart"/>
       <w:r>
         <w:rPr>
           <w:b/>
@@ -326,15 +471,9 @@
           <w:sz w:val="28"/>
           <w:szCs w:val="28"/>
         </w:rPr>
-        <w:t>fgetcsv()</w:t>
-      </w:r>
-      <w:r>
-        <w:rPr>
-          <w:sz w:val="28"/>
-          <w:szCs w:val="28"/>
-        </w:rPr>
-        <w:t> allows you to read CSV file line by line, </w:t>
-      </w:r>
+        <w:t>fgetcsv</w:t>
+      </w:r>
+      <w:proofErr w:type="spellEnd"/>
       <w:r>
         <w:rPr>
           <w:b/>
@@ -342,15 +481,9 @@
           <w:sz w:val="28"/>
           <w:szCs w:val="28"/>
         </w:rPr>
-        <w:t>fputcsv()</w:t>
-      </w:r>
-      <w:r>
-        <w:rPr>
-          <w:sz w:val="28"/>
-          <w:szCs w:val="28"/>
-        </w:rPr>
-        <w:t> lets you write line by line into a CSV file, and </w:t>
-      </w:r>
+        <w:t>(</w:t>
+      </w:r>
+      <w:proofErr w:type="gramEnd"/>
       <w:r>
         <w:rPr>
           <w:b/>
@@ -358,7 +491,92 @@
           <w:sz w:val="28"/>
           <w:szCs w:val="28"/>
         </w:rPr>
-        <w:t>str_getcsv()</w:t>
+        <w:t>)</w:t>
+      </w:r>
+      <w:r>
+        <w:rPr>
+          <w:sz w:val="28"/>
+          <w:szCs w:val="28"/>
+        </w:rPr>
+        <w:t> allows you to read CSV file line by line, </w:t>
+      </w:r>
+      <w:proofErr w:type="spellStart"/>
+      <w:proofErr w:type="gramStart"/>
+      <w:r>
+        <w:rPr>
+          <w:b/>
+          <w:bCs/>
+          <w:sz w:val="28"/>
+          <w:szCs w:val="28"/>
+        </w:rPr>
+        <w:t>fputcsv</w:t>
+      </w:r>
+      <w:proofErr w:type="spellEnd"/>
+      <w:r>
+        <w:rPr>
+          <w:b/>
+          <w:bCs/>
+          <w:sz w:val="28"/>
+          <w:szCs w:val="28"/>
+        </w:rPr>
+        <w:t>(</w:t>
+      </w:r>
+      <w:proofErr w:type="gramEnd"/>
+      <w:r>
+        <w:rPr>
+          <w:b/>
+          <w:bCs/>
+          <w:sz w:val="28"/>
+          <w:szCs w:val="28"/>
+        </w:rPr>
+        <w:t>)</w:t>
+      </w:r>
+      <w:r>
+        <w:rPr>
+          <w:sz w:val="28"/>
+          <w:szCs w:val="28"/>
+        </w:rPr>
+        <w:t> lets you write line by line into a CSV file, and </w:t>
+      </w:r>
+      <w:proofErr w:type="spellStart"/>
+      <w:r>
+        <w:rPr>
+          <w:b/>
+          <w:bCs/>
+          <w:sz w:val="28"/>
+          <w:szCs w:val="28"/>
+        </w:rPr>
+        <w:t>str_</w:t>
+      </w:r>
+      <w:proofErr w:type="gramStart"/>
+      <w:r>
+        <w:rPr>
+          <w:b/>
+          <w:bCs/>
+          <w:sz w:val="28"/>
+          <w:szCs w:val="28"/>
+        </w:rPr>
+        <w:t>getcsv</w:t>
+      </w:r>
+      <w:proofErr w:type="spellEnd"/>
+      <w:r>
+        <w:rPr>
+          <w:b/>
+          <w:bCs/>
+          <w:sz w:val="28"/>
+          <w:szCs w:val="28"/>
+        </w:rPr>
+        <w:t>(</w:t>
+      </w:r>
+      <w:proofErr w:type="gramEnd"/>
+      <w:r>
+        <w:rPr>
+          <w:b/>
+          <w:bCs/>
+          <w:sz w:val="28"/>
+          <w:szCs w:val="28"/>
+        </w:rPr>
+        <w:t>)</w:t>
       </w:r>
       <w:r>
         <w:rPr>
@@ -399,7 +617,23 @@
           <w:sz w:val="28"/>
           <w:szCs w:val="28"/>
         </w:rPr>
-        <w:t>In classes, the pseudo-variable $this is available when the method is called from within an objects context</w:t>
+        <w:t xml:space="preserve">In classes, the pseudo-variable $this is available when the method is called from within an </w:t>
+      </w:r>
+      <w:proofErr w:type="gramStart"/>
+      <w:r>
+        <w:rPr>
+          <w:sz w:val="28"/>
+          <w:szCs w:val="28"/>
+        </w:rPr>
+        <w:t>objects</w:t>
+      </w:r>
+      <w:proofErr w:type="gramEnd"/>
+      <w:r>
+        <w:rPr>
+          <w:sz w:val="28"/>
+          <w:szCs w:val="28"/>
+        </w:rPr>
+        <w:t xml:space="preserve"> context</w:t>
       </w:r>
     </w:p>
     <w:p>
@@ -421,7 +655,23 @@
           <w:sz w:val="28"/>
           <w:szCs w:val="28"/>
         </w:rPr>
-        <w:t>. Uses the static keyword. The properties is the same, but they can</w:t>
+        <w:t xml:space="preserve">. Uses the static keyword. The properties </w:t>
+      </w:r>
+      <w:proofErr w:type="gramStart"/>
+      <w:r>
+        <w:rPr>
+          <w:sz w:val="28"/>
+          <w:szCs w:val="28"/>
+        </w:rPr>
+        <w:t>is</w:t>
+      </w:r>
+      <w:proofErr w:type="gramEnd"/>
+      <w:r>
+        <w:rPr>
+          <w:sz w:val="28"/>
+          <w:szCs w:val="28"/>
+        </w:rPr>
+        <w:t xml:space="preserve"> the same, but they can</w:t>
       </w:r>
       <w:r>
         <w:rPr>
@@ -450,8 +700,17 @@
           <w:sz w:val="28"/>
           <w:szCs w:val="28"/>
         </w:rPr>
-        <w:t>TRAITS-implements a way to reuse codes in single inheritance languages such as php</w:t>
-      </w:r>
+        <w:t xml:space="preserve">TRAITS-implements a way to reuse codes in single inheritance languages such as </w:t>
+      </w:r>
+      <w:proofErr w:type="spellStart"/>
+      <w:r>
+        <w:rPr>
+          <w:sz w:val="28"/>
+          <w:szCs w:val="28"/>
+        </w:rPr>
+        <w:t>php</w:t>
+      </w:r>
+      <w:proofErr w:type="spellEnd"/>
       <w:r>
         <w:rPr>
           <w:sz w:val="28"/>
@@ -473,6 +732,78 @@
           <w:szCs w:val="28"/>
         </w:rPr>
         <w:t>NAMESPACES-a way of encapsulating items so that name collisions won’t occur. Uses the keyword ‘namespace’</w:t>
+      </w:r>
+    </w:p>
+    <w:p>
+      <w:pPr>
+        <w:rPr>
+          <w:sz w:val="28"/>
+          <w:szCs w:val="28"/>
+        </w:rPr>
+      </w:pPr>
+      <w:r>
+        <w:rPr>
+          <w:b/>
+          <w:bCs/>
+          <w:sz w:val="36"/>
+          <w:szCs w:val="36"/>
+        </w:rPr>
+        <w:t>Interface</w:t>
+      </w:r>
+      <w:r>
+        <w:rPr>
+          <w:sz w:val="36"/>
+          <w:szCs w:val="36"/>
+        </w:rPr>
+        <w:t xml:space="preserve">: </w:t>
+      </w:r>
+      <w:r>
+        <w:rPr>
+          <w:sz w:val="28"/>
+          <w:szCs w:val="28"/>
+        </w:rPr>
+        <w:t xml:space="preserve">Defines a contract. Any class that implements </w:t>
+      </w:r>
+      <w:proofErr w:type="spellStart"/>
+      <w:r>
+        <w:rPr>
+          <w:sz w:val="28"/>
+          <w:szCs w:val="28"/>
+        </w:rPr>
+        <w:t>InventoryInterface</w:t>
+      </w:r>
+      <w:proofErr w:type="spellEnd"/>
+      <w:r>
+        <w:rPr>
+          <w:sz w:val="28"/>
+          <w:szCs w:val="28"/>
+        </w:rPr>
+        <w:t xml:space="preserve"> must provide a </w:t>
+      </w:r>
+      <w:proofErr w:type="spellStart"/>
+      <w:proofErr w:type="gramStart"/>
+      <w:r>
+        <w:rPr>
+          <w:sz w:val="28"/>
+          <w:szCs w:val="28"/>
+        </w:rPr>
+        <w:t>getName</w:t>
+      </w:r>
+      <w:proofErr w:type="spellEnd"/>
+      <w:r>
+        <w:rPr>
+          <w:sz w:val="28"/>
+          <w:szCs w:val="28"/>
+        </w:rPr>
+        <w:t>(</w:t>
+      </w:r>
+      <w:proofErr w:type="gramEnd"/>
+      <w:r>
+        <w:rPr>
+          <w:sz w:val="28"/>
+          <w:szCs w:val="28"/>
+        </w:rPr>
+        <w:t>) method.</w:t>
       </w:r>
     </w:p>
     <w:p>
@@ -1096,7 +1427,6 @@
   <w:style w:type="character" w:default="1" w:styleId="DefaultParagraphFont">
     <w:name w:val="Default Paragraph Font"/>
     <w:uiPriority w:val="1"/>
-    <w:semiHidden/>
     <w:unhideWhenUsed/>
   </w:style>
   <w:style w:type="table" w:default="1" w:styleId="TableNormal">

</xml_diff>

<commit_message>
Few modes and construnctor explanation
</commit_message>
<xml_diff>
--- a/PHP notes.docx
+++ b/PHP notes.docx
@@ -87,17 +87,8 @@
           <w:sz w:val="28"/>
           <w:szCs w:val="28"/>
         </w:rPr>
-        <w:t xml:space="preserve">Function </w:t>
-      </w:r>
-      <w:proofErr w:type="gramStart"/>
-      <w:r>
-        <w:rPr>
-          <w:sz w:val="28"/>
-          <w:szCs w:val="28"/>
-        </w:rPr>
-        <w:t>sum(){</w:t>
-      </w:r>
-      <w:proofErr w:type="gramEnd"/>
+        <w:t>Function sum(){</w:t>
+      </w:r>
     </w:p>
     <w:p>
       <w:pPr>
@@ -151,21 +142,12 @@
           <w:szCs w:val="28"/>
         </w:rPr>
       </w:pPr>
-      <w:proofErr w:type="gramStart"/>
-      <w:r>
-        <w:rPr>
-          <w:sz w:val="28"/>
-          <w:szCs w:val="28"/>
-        </w:rPr>
-        <w:t>Sum(</w:t>
-      </w:r>
-      <w:proofErr w:type="gramEnd"/>
-      <w:r>
-        <w:rPr>
-          <w:sz w:val="28"/>
-          <w:szCs w:val="28"/>
-        </w:rPr>
-        <w:t>);</w:t>
+      <w:r>
+        <w:rPr>
+          <w:sz w:val="28"/>
+          <w:szCs w:val="28"/>
+        </w:rPr>
+        <w:t>Sum();</w:t>
       </w:r>
     </w:p>
     <w:p>
@@ -195,39 +177,7 @@
           <w:sz w:val="28"/>
           <w:szCs w:val="28"/>
         </w:rPr>
-        <w:t xml:space="preserve">The above example </w:t>
-      </w:r>
-      <w:proofErr w:type="gramStart"/>
-      <w:r>
-        <w:rPr>
-          <w:sz w:val="28"/>
-          <w:szCs w:val="28"/>
-        </w:rPr>
-        <w:t>showcase</w:t>
-      </w:r>
-      <w:proofErr w:type="gramEnd"/>
-      <w:r>
-        <w:rPr>
-          <w:sz w:val="28"/>
-          <w:szCs w:val="28"/>
-        </w:rPr>
-        <w:t xml:space="preserve"> how you can access it. </w:t>
-      </w:r>
-      <w:proofErr w:type="gramStart"/>
-      <w:r>
-        <w:rPr>
-          <w:sz w:val="28"/>
-          <w:szCs w:val="28"/>
-        </w:rPr>
-        <w:t>The  other</w:t>
-      </w:r>
-      <w:proofErr w:type="gramEnd"/>
-      <w:r>
-        <w:rPr>
-          <w:sz w:val="28"/>
-          <w:szCs w:val="28"/>
-        </w:rPr>
-        <w:t xml:space="preserve"> method is through an associative array keyword with the name of the global variable being the key and the that variable being the value</w:t>
+        <w:t>The above example showcase how you can access it. The  other method is through an associative array keyword with the name of the global variable being the key and the that variable being the value</w:t>
       </w:r>
     </w:p>
     <w:p>
@@ -299,37 +249,12 @@
         </w:rPr>
         <w:t xml:space="preserve"> </w:t>
       </w:r>
-      <w:proofErr w:type="gramStart"/>
-      <w:r>
-        <w:rPr>
-          <w:sz w:val="28"/>
-          <w:szCs w:val="28"/>
-        </w:rPr>
-        <w:t>Match( it</w:t>
-      </w:r>
-      <w:proofErr w:type="gramEnd"/>
-      <w:r>
-        <w:rPr>
-          <w:sz w:val="28"/>
-          <w:szCs w:val="28"/>
-        </w:rPr>
-        <w:t xml:space="preserve"> is a type of multiple conditional </w:t>
-      </w:r>
-      <w:proofErr w:type="gramStart"/>
-      <w:r>
-        <w:rPr>
-          <w:sz w:val="28"/>
-          <w:szCs w:val="28"/>
-        </w:rPr>
-        <w:t>function )</w:t>
-      </w:r>
-      <w:proofErr w:type="gramEnd"/>
-      <w:r>
-        <w:rPr>
-          <w:sz w:val="28"/>
-          <w:szCs w:val="28"/>
-        </w:rPr>
-        <w:t xml:space="preserve"> is a better version of switch</w:t>
+      <w:r>
+        <w:rPr>
+          <w:sz w:val="28"/>
+          <w:szCs w:val="28"/>
+        </w:rPr>
+        <w:t>Match( it is a type of multiple conditional function ) is a better version of switch</w:t>
       </w:r>
     </w:p>
     <w:p>
@@ -362,7 +287,6 @@
         <w:t xml:space="preserve">Named argument-Usually used when you want to assign a value without having to rely on </w:t>
       </w:r>
       <w:proofErr w:type="spellStart"/>
-      <w:proofErr w:type="gramStart"/>
       <w:r>
         <w:rPr>
           <w:sz w:val="28"/>
@@ -371,29 +295,12 @@
         <w:t>it’s</w:t>
       </w:r>
       <w:proofErr w:type="spellEnd"/>
-      <w:proofErr w:type="gramEnd"/>
-      <w:r>
-        <w:rPr>
-          <w:sz w:val="28"/>
-          <w:szCs w:val="28"/>
-        </w:rPr>
-        <w:t xml:space="preserve"> position only. For example: </w:t>
-      </w:r>
-      <w:proofErr w:type="gramStart"/>
-      <w:r>
-        <w:rPr>
-          <w:sz w:val="28"/>
-          <w:szCs w:val="28"/>
-        </w:rPr>
-        <w:t>sum(</w:t>
-      </w:r>
-      <w:proofErr w:type="gramEnd"/>
-      <w:r>
-        <w:rPr>
-          <w:sz w:val="28"/>
-          <w:szCs w:val="28"/>
-        </w:rPr>
-        <w:t>a= 1, d= 3) see that I’ve assigned d where b should, yet, it will still register d as 3.</w:t>
+      <w:r>
+        <w:rPr>
+          <w:sz w:val="28"/>
+          <w:szCs w:val="28"/>
+        </w:rPr>
+        <w:t xml:space="preserve"> position only. For example: sum(a= 1, d= 3) see that I’ve assigned d where b should, yet, it will still register d as 3.</w:t>
       </w:r>
     </w:p>
     <w:p>
@@ -463,7 +370,6 @@
         <w:t>CSV processing refers to handling CSV (Comma Separated Values) files in PHP, an operation significantly useful for managing tabular data. PHP provides a few key functions to handle CSV files effectively. For example, </w:t>
       </w:r>
       <w:proofErr w:type="spellStart"/>
-      <w:proofErr w:type="gramStart"/>
       <w:r>
         <w:rPr>
           <w:b/>
@@ -481,9 +387,16 @@
           <w:sz w:val="28"/>
           <w:szCs w:val="28"/>
         </w:rPr>
-        <w:t>(</w:t>
-      </w:r>
-      <w:proofErr w:type="gramEnd"/>
+        <w:t>()</w:t>
+      </w:r>
+      <w:r>
+        <w:rPr>
+          <w:sz w:val="28"/>
+          <w:szCs w:val="28"/>
+        </w:rPr>
+        <w:t> allows you to read CSV file line by line, </w:t>
+      </w:r>
+      <w:proofErr w:type="spellStart"/>
       <w:r>
         <w:rPr>
           <w:b/>
@@ -491,17 +404,9 @@
           <w:sz w:val="28"/>
           <w:szCs w:val="28"/>
         </w:rPr>
-        <w:t>)</w:t>
-      </w:r>
-      <w:r>
-        <w:rPr>
-          <w:sz w:val="28"/>
-          <w:szCs w:val="28"/>
-        </w:rPr>
-        <w:t> allows you to read CSV file line by line, </w:t>
-      </w:r>
-      <w:proofErr w:type="spellStart"/>
-      <w:proofErr w:type="gramStart"/>
+        <w:t>fputcsv</w:t>
+      </w:r>
+      <w:proofErr w:type="spellEnd"/>
       <w:r>
         <w:rPr>
           <w:b/>
@@ -509,9 +414,16 @@
           <w:sz w:val="28"/>
           <w:szCs w:val="28"/>
         </w:rPr>
-        <w:t>fputcsv</w:t>
-      </w:r>
-      <w:proofErr w:type="spellEnd"/>
+        <w:t>()</w:t>
+      </w:r>
+      <w:r>
+        <w:rPr>
+          <w:sz w:val="28"/>
+          <w:szCs w:val="28"/>
+        </w:rPr>
+        <w:t> lets you write line by line into a CSV file, and </w:t>
+      </w:r>
+      <w:proofErr w:type="spellStart"/>
       <w:r>
         <w:rPr>
           <w:b/>
@@ -519,9 +431,9 @@
           <w:sz w:val="28"/>
           <w:szCs w:val="28"/>
         </w:rPr>
-        <w:t>(</w:t>
-      </w:r>
-      <w:proofErr w:type="gramEnd"/>
+        <w:t>str_getcsv</w:t>
+      </w:r>
+      <w:proofErr w:type="spellEnd"/>
       <w:r>
         <w:rPr>
           <w:b/>
@@ -529,54 +441,7 @@
           <w:sz w:val="28"/>
           <w:szCs w:val="28"/>
         </w:rPr>
-        <w:t>)</w:t>
-      </w:r>
-      <w:r>
-        <w:rPr>
-          <w:sz w:val="28"/>
-          <w:szCs w:val="28"/>
-        </w:rPr>
-        <w:t> lets you write line by line into a CSV file, and </w:t>
-      </w:r>
-      <w:proofErr w:type="spellStart"/>
-      <w:r>
-        <w:rPr>
-          <w:b/>
-          <w:bCs/>
-          <w:sz w:val="28"/>
-          <w:szCs w:val="28"/>
-        </w:rPr>
-        <w:t>str_</w:t>
-      </w:r>
-      <w:proofErr w:type="gramStart"/>
-      <w:r>
-        <w:rPr>
-          <w:b/>
-          <w:bCs/>
-          <w:sz w:val="28"/>
-          <w:szCs w:val="28"/>
-        </w:rPr>
-        <w:t>getcsv</w:t>
-      </w:r>
-      <w:proofErr w:type="spellEnd"/>
-      <w:r>
-        <w:rPr>
-          <w:b/>
-          <w:bCs/>
-          <w:sz w:val="28"/>
-          <w:szCs w:val="28"/>
-        </w:rPr>
-        <w:t>(</w:t>
-      </w:r>
-      <w:proofErr w:type="gramEnd"/>
-      <w:r>
-        <w:rPr>
-          <w:b/>
-          <w:bCs/>
-          <w:sz w:val="28"/>
-          <w:szCs w:val="28"/>
-        </w:rPr>
-        <w:t>)</w:t>
+        <w:t>()</w:t>
       </w:r>
       <w:r>
         <w:rPr>
@@ -617,23 +482,7 @@
           <w:sz w:val="28"/>
           <w:szCs w:val="28"/>
         </w:rPr>
-        <w:t xml:space="preserve">In classes, the pseudo-variable $this is available when the method is called from within an </w:t>
-      </w:r>
-      <w:proofErr w:type="gramStart"/>
-      <w:r>
-        <w:rPr>
-          <w:sz w:val="28"/>
-          <w:szCs w:val="28"/>
-        </w:rPr>
-        <w:t>objects</w:t>
-      </w:r>
-      <w:proofErr w:type="gramEnd"/>
-      <w:r>
-        <w:rPr>
-          <w:sz w:val="28"/>
-          <w:szCs w:val="28"/>
-        </w:rPr>
-        <w:t xml:space="preserve"> context</w:t>
+        <w:t>In classes, the pseudo-variable $this is available when the method is called from within an objects context</w:t>
       </w:r>
     </w:p>
     <w:p>
@@ -655,23 +504,7 @@
           <w:sz w:val="28"/>
           <w:szCs w:val="28"/>
         </w:rPr>
-        <w:t xml:space="preserve">. Uses the static keyword. The properties </w:t>
-      </w:r>
-      <w:proofErr w:type="gramStart"/>
-      <w:r>
-        <w:rPr>
-          <w:sz w:val="28"/>
-          <w:szCs w:val="28"/>
-        </w:rPr>
-        <w:t>is</w:t>
-      </w:r>
-      <w:proofErr w:type="gramEnd"/>
-      <w:r>
-        <w:rPr>
-          <w:sz w:val="28"/>
-          <w:szCs w:val="28"/>
-        </w:rPr>
-        <w:t xml:space="preserve"> the same, but they can</w:t>
+        <w:t>. Uses the static keyword. The properties is the same, but they can</w:t>
       </w:r>
       <w:r>
         <w:rPr>
@@ -781,7 +614,6 @@
         <w:t xml:space="preserve"> must provide a </w:t>
       </w:r>
       <w:proofErr w:type="spellStart"/>
-      <w:proofErr w:type="gramStart"/>
       <w:r>
         <w:rPr>
           <w:sz w:val="28"/>
@@ -795,24 +627,55 @@
           <w:sz w:val="28"/>
           <w:szCs w:val="28"/>
         </w:rPr>
-        <w:t>(</w:t>
-      </w:r>
-      <w:proofErr w:type="gramEnd"/>
-      <w:r>
-        <w:rPr>
-          <w:sz w:val="28"/>
-          <w:szCs w:val="28"/>
-        </w:rPr>
-        <w:t>) method.</w:t>
-      </w:r>
-    </w:p>
-    <w:p>
-      <w:pPr>
-        <w:rPr>
-          <w:sz w:val="28"/>
-          <w:szCs w:val="28"/>
-        </w:rPr>
-      </w:pPr>
+        <w:t>() method.</w:t>
+      </w:r>
+    </w:p>
+    <w:p>
+      <w:pPr>
+        <w:rPr>
+          <w:sz w:val="28"/>
+          <w:szCs w:val="28"/>
+        </w:rPr>
+      </w:pPr>
+      <w:r>
+        <w:rPr>
+          <w:sz w:val="28"/>
+          <w:szCs w:val="28"/>
+        </w:rPr>
+        <w:t xml:space="preserve">In PHP, a </w:t>
+      </w:r>
+      <w:r>
+        <w:rPr>
+          <w:b/>
+          <w:bCs/>
+          <w:sz w:val="28"/>
+          <w:szCs w:val="28"/>
+        </w:rPr>
+        <w:t>constructor</w:t>
+      </w:r>
+      <w:r>
+        <w:rPr>
+          <w:sz w:val="28"/>
+          <w:szCs w:val="28"/>
+        </w:rPr>
+        <w:t xml:space="preserve"> (__construct) is a special method that runs automatically whenever you create a new instance of a class. Its purpose is to </w:t>
+      </w:r>
+      <w:r>
+        <w:rPr>
+          <w:b/>
+          <w:bCs/>
+          <w:sz w:val="28"/>
+          <w:szCs w:val="28"/>
+        </w:rPr>
+        <w:t>initialize the object’s properties</w:t>
+      </w:r>
+      <w:r>
+        <w:rPr>
+          <w:sz w:val="28"/>
+          <w:szCs w:val="28"/>
+        </w:rPr>
+        <w:t xml:space="preserve"> with values you provide at the moment of creation.</w:t>
+      </w:r>
     </w:p>
     <w:sectPr>
       <w:pgSz w:w="12240" w:h="15840"/>

</xml_diff>

<commit_message>
Update elmination of duplicates
</commit_message>
<xml_diff>
--- a/PHP notes.docx
+++ b/PHP notes.docx
@@ -33,8 +33,17 @@
           <w:sz w:val="28"/>
           <w:szCs w:val="28"/>
         </w:rPr>
-        <w:t>You can be able to access them through either the key name global e.g</w:t>
-      </w:r>
+        <w:t xml:space="preserve">You can be able to access them through either the key name global </w:t>
+      </w:r>
+      <w:proofErr w:type="spellStart"/>
+      <w:r>
+        <w:rPr>
+          <w:sz w:val="28"/>
+          <w:szCs w:val="28"/>
+        </w:rPr>
+        <w:t>e.g</w:t>
+      </w:r>
+      <w:proofErr w:type="spellEnd"/>
     </w:p>
     <w:p>
       <w:pPr>
@@ -193,12 +202,37 @@
           <w:szCs w:val="28"/>
         </w:rPr>
       </w:pPr>
-      <w:r>
-        <w:rPr>
-          <w:sz w:val="28"/>
-          <w:szCs w:val="28"/>
-        </w:rPr>
-        <w:t>Var_dump – allows you to fully understand what your code is supposed to output. It is very handy for debugging. Same to print_f;</w:t>
+      <w:proofErr w:type="spellStart"/>
+      <w:r>
+        <w:rPr>
+          <w:sz w:val="28"/>
+          <w:szCs w:val="28"/>
+        </w:rPr>
+        <w:t>Var_dump</w:t>
+      </w:r>
+      <w:proofErr w:type="spellEnd"/>
+      <w:r>
+        <w:rPr>
+          <w:sz w:val="28"/>
+          <w:szCs w:val="28"/>
+        </w:rPr>
+        <w:t xml:space="preserve"> – allows you to fully understand what your code is supposed to output. It is very handy for debugging. Same to </w:t>
+      </w:r>
+      <w:proofErr w:type="spellStart"/>
+      <w:r>
+        <w:rPr>
+          <w:sz w:val="28"/>
+          <w:szCs w:val="28"/>
+        </w:rPr>
+        <w:t>print_f</w:t>
+      </w:r>
+      <w:proofErr w:type="spellEnd"/>
+      <w:r>
+        <w:rPr>
+          <w:sz w:val="28"/>
+          <w:szCs w:val="28"/>
+        </w:rPr>
+        <w:t>;</w:t>
       </w:r>
     </w:p>
     <w:p>
@@ -250,7 +284,23 @@
           <w:sz w:val="28"/>
           <w:szCs w:val="28"/>
         </w:rPr>
-        <w:t>Named argument-Usually used when you want to assign a value without having to rely on it’s position only. For example: sum(a= 1, d= 3) see that I’ve assigned d where b should, yet, it will still register d as 3.</w:t>
+        <w:t xml:space="preserve">Named argument-Usually used when you want to assign a value without having to rely on </w:t>
+      </w:r>
+      <w:proofErr w:type="spellStart"/>
+      <w:r>
+        <w:rPr>
+          <w:sz w:val="28"/>
+          <w:szCs w:val="28"/>
+        </w:rPr>
+        <w:t>it’s</w:t>
+      </w:r>
+      <w:proofErr w:type="spellEnd"/>
+      <w:r>
+        <w:rPr>
+          <w:sz w:val="28"/>
+          <w:szCs w:val="28"/>
+        </w:rPr>
+        <w:t xml:space="preserve"> position only. For example: sum(a= 1, d= 3) see that I’ve assigned d where b should, yet, it will still register d as 3.</w:t>
       </w:r>
     </w:p>
     <w:p>
@@ -319,6 +369,7 @@
         </w:rPr>
         <w:t>CSV processing refers to handling CSV (Comma Separated Values) files in PHP, an operation significantly useful for managing tabular data. PHP provides a few key functions to handle CSV files effectively. For example, </w:t>
       </w:r>
+      <w:proofErr w:type="spellStart"/>
       <w:r>
         <w:rPr>
           <w:b/>
@@ -326,15 +377,9 @@
           <w:sz w:val="28"/>
           <w:szCs w:val="28"/>
         </w:rPr>
-        <w:t>fgetcsv()</w:t>
-      </w:r>
-      <w:r>
-        <w:rPr>
-          <w:sz w:val="28"/>
-          <w:szCs w:val="28"/>
-        </w:rPr>
-        <w:t> allows you to read CSV file line by line, </w:t>
-      </w:r>
+        <w:t>fgetcsv</w:t>
+      </w:r>
+      <w:proofErr w:type="spellEnd"/>
       <w:r>
         <w:rPr>
           <w:b/>
@@ -342,15 +387,16 @@
           <w:sz w:val="28"/>
           <w:szCs w:val="28"/>
         </w:rPr>
-        <w:t>fputcsv()</w:t>
-      </w:r>
-      <w:r>
-        <w:rPr>
-          <w:sz w:val="28"/>
-          <w:szCs w:val="28"/>
-        </w:rPr>
-        <w:t> lets you write line by line into a CSV file, and </w:t>
-      </w:r>
+        <w:t>()</w:t>
+      </w:r>
+      <w:r>
+        <w:rPr>
+          <w:sz w:val="28"/>
+          <w:szCs w:val="28"/>
+        </w:rPr>
+        <w:t> allows you to read CSV file line by line, </w:t>
+      </w:r>
+      <w:proofErr w:type="spellStart"/>
       <w:r>
         <w:rPr>
           <w:b/>
@@ -358,7 +404,44 @@
           <w:sz w:val="28"/>
           <w:szCs w:val="28"/>
         </w:rPr>
-        <w:t>str_getcsv()</w:t>
+        <w:t>fputcsv</w:t>
+      </w:r>
+      <w:proofErr w:type="spellEnd"/>
+      <w:r>
+        <w:rPr>
+          <w:b/>
+          <w:bCs/>
+          <w:sz w:val="28"/>
+          <w:szCs w:val="28"/>
+        </w:rPr>
+        <w:t>()</w:t>
+      </w:r>
+      <w:r>
+        <w:rPr>
+          <w:sz w:val="28"/>
+          <w:szCs w:val="28"/>
+        </w:rPr>
+        <w:t> lets you write line by line into a CSV file, and </w:t>
+      </w:r>
+      <w:proofErr w:type="spellStart"/>
+      <w:r>
+        <w:rPr>
+          <w:b/>
+          <w:bCs/>
+          <w:sz w:val="28"/>
+          <w:szCs w:val="28"/>
+        </w:rPr>
+        <w:t>str_getcsv</w:t>
+      </w:r>
+      <w:proofErr w:type="spellEnd"/>
+      <w:r>
+        <w:rPr>
+          <w:b/>
+          <w:bCs/>
+          <w:sz w:val="28"/>
+          <w:szCs w:val="28"/>
+        </w:rPr>
+        <w:t>()</w:t>
       </w:r>
       <w:r>
         <w:rPr>
@@ -450,8 +533,17 @@
           <w:sz w:val="28"/>
           <w:szCs w:val="28"/>
         </w:rPr>
-        <w:t>TRAITS-implements a way to reuse codes in single inheritance languages such as php</w:t>
-      </w:r>
+        <w:t xml:space="preserve">TRAITS-implements a way to reuse codes in single inheritance languages such as </w:t>
+      </w:r>
+      <w:proofErr w:type="spellStart"/>
+      <w:r>
+        <w:rPr>
+          <w:sz w:val="28"/>
+          <w:szCs w:val="28"/>
+        </w:rPr>
+        <w:t>php</w:t>
+      </w:r>
+      <w:proofErr w:type="spellEnd"/>
       <w:r>
         <w:rPr>
           <w:sz w:val="28"/>
@@ -503,7 +595,39 @@
           <w:sz w:val="28"/>
           <w:szCs w:val="28"/>
         </w:rPr>
-        <w:t>Defines a contract. Any class that implements InventoryInterface must provide a getName() method.</w:t>
+        <w:t xml:space="preserve">Defines a contract. Any class that implements </w:t>
+      </w:r>
+      <w:proofErr w:type="spellStart"/>
+      <w:r>
+        <w:rPr>
+          <w:sz w:val="28"/>
+          <w:szCs w:val="28"/>
+        </w:rPr>
+        <w:t>InventoryInterface</w:t>
+      </w:r>
+      <w:proofErr w:type="spellEnd"/>
+      <w:r>
+        <w:rPr>
+          <w:sz w:val="28"/>
+          <w:szCs w:val="28"/>
+        </w:rPr>
+        <w:t xml:space="preserve"> must provide a </w:t>
+      </w:r>
+      <w:proofErr w:type="spellStart"/>
+      <w:r>
+        <w:rPr>
+          <w:sz w:val="28"/>
+          <w:szCs w:val="28"/>
+        </w:rPr>
+        <w:t>getName</w:t>
+      </w:r>
+      <w:proofErr w:type="spellEnd"/>
+      <w:r>
+        <w:rPr>
+          <w:sz w:val="28"/>
+          <w:szCs w:val="28"/>
+        </w:rPr>
+        <w:t>() method.</w:t>
       </w:r>
     </w:p>
     <w:p>
@@ -568,11 +692,36 @@
           <w:szCs w:val="28"/>
         </w:rPr>
       </w:pPr>
-      <w:r>
-        <w:rPr>
-          <w:sz w:val="28"/>
-          <w:szCs w:val="28"/>
-        </w:rPr>
+    </w:p>
+    <w:p>
+      <w:pPr>
+        <w:rPr>
+          <w:sz w:val="28"/>
+          <w:szCs w:val="28"/>
+        </w:rPr>
+      </w:pPr>
+    </w:p>
+    <w:p>
+      <w:pPr>
+        <w:rPr>
+          <w:sz w:val="28"/>
+          <w:szCs w:val="28"/>
+        </w:rPr>
+      </w:pPr>
+    </w:p>
+    <w:p>
+      <w:pPr>
+        <w:rPr>
+          <w:sz w:val="28"/>
+          <w:szCs w:val="28"/>
+        </w:rPr>
+      </w:pPr>
+      <w:r>
+        <w:rPr>
+          <w:sz w:val="28"/>
+          <w:szCs w:val="28"/>
+        </w:rPr>
+        <w:lastRenderedPageBreak/>
         <w:t>LINKED LISTS</w:t>
       </w:r>
     </w:p>
@@ -588,7 +737,79 @@
           <w:sz w:val="28"/>
           <w:szCs w:val="28"/>
         </w:rPr>
-        <w:t>The are terrible in search, but you can use a linked list with either a stack, you just have to use the code word push, pop. You can also use it as a queue, just change to offer or poll ( Though I think this is Java oriented)</w:t>
+        <w:t>Nodes are in Non-consecutive memory locations and elements are linked using pointers.</w:t>
+      </w:r>
+    </w:p>
+    <w:p>
+      <w:pPr>
+        <w:rPr>
+          <w:sz w:val="28"/>
+          <w:szCs w:val="28"/>
+        </w:rPr>
+      </w:pPr>
+      <w:r>
+        <w:rPr>
+          <w:sz w:val="28"/>
+          <w:szCs w:val="28"/>
+        </w:rPr>
+        <w:t xml:space="preserve">You have to traverse from </w:t>
+      </w:r>
+      <w:r>
+        <w:rPr>
+          <w:sz w:val="28"/>
+          <w:szCs w:val="28"/>
+        </w:rPr>
+        <w:t>one point to the next so no random access to elements(</w:t>
+      </w:r>
+      <w:r>
+        <w:rPr>
+          <w:sz w:val="28"/>
+          <w:szCs w:val="28"/>
+        </w:rPr>
+        <w:t>for singly, you can go from head to tail but for double you can go from the head to tail, or vice versa)</w:t>
+      </w:r>
+      <w:r>
+        <w:rPr>
+          <w:sz w:val="28"/>
+          <w:szCs w:val="28"/>
+        </w:rPr>
+        <w:t xml:space="preserve"> </w:t>
+      </w:r>
+      <w:r>
+        <w:rPr>
+          <w:sz w:val="28"/>
+          <w:szCs w:val="28"/>
+        </w:rPr>
+        <w:t>and</w:t>
+      </w:r>
+      <w:r>
+        <w:rPr>
+          <w:sz w:val="28"/>
+          <w:szCs w:val="28"/>
+        </w:rPr>
+        <w:t xml:space="preserve"> you can use a linked list with either a stack, you just have to use the code word push, pop. You can also use it as a queue, just change to offer or poll ( Though I think this is Java oriented)</w:t>
+      </w:r>
+      <w:r>
+        <w:rPr>
+          <w:sz w:val="28"/>
+          <w:szCs w:val="28"/>
+        </w:rPr>
+        <w:t xml:space="preserve">. </w:t>
+      </w:r>
+    </w:p>
+    <w:p>
+      <w:pPr>
+        <w:rPr>
+          <w:sz w:val="28"/>
+          <w:szCs w:val="28"/>
+        </w:rPr>
+      </w:pPr>
+      <w:r>
+        <w:rPr>
+          <w:sz w:val="28"/>
+          <w:szCs w:val="28"/>
+        </w:rPr>
+        <w:t>It is really good in the deletion and insertion of nodes(more of advantage as compared to arrays)( uses time complexity of 0(1). All you have to do is change the address of the previous and next node. In Java, when you declare a linked lists, it is usually a double linked list, though there are various types, singly, and circular as well.</w:t>
       </w:r>
     </w:p>
     <w:sectPr>

</xml_diff>